<commit_message>
chore: identity separation of the public tree -- only the operator pseudonym remains, the partner project is named by pseudonym, and scratch files are ignored (LENS-046)
Ruling B (the operator, LENS-046). Direct identifiers suppressed; location generalized to UTC+7; the partner project pseudonymized as Partner A with no rule numbers, paths, session numbers or commit hashes carried across; office-file metadata cleaned; two files whose names carried a local temp path renamed; one local-clock variable renamed. Guided by ISO/IEC 20889, NIST IR 8053 and SP 800-188, and ENISA's pseudonymisation guidance. Dry run reviewed line by line before apply; an independent re-scan of the result and a case-insensitive scan of the staged index found nothing; every CI test green. History and the partner side follow at one agreed boundary.
</commit_message>
<xml_diff>
--- a/data/lens-DOC-007_guard_system_spec.docx
+++ b/data/lens-DOC-007_guard_system_spec.docx
@@ -78,7 +78,7 @@
           <w:sz w:val="22"/>
           <w:szCs w:val="22"/>
         </w:rPr>
-        <w:t>Author: Bro Alpha (James Maverick) + Claude</w:t>
+        <w:t>Author: Bro Alpha + Claude</w:t>
       </w:r>
     </w:p>
     <w:p>
@@ -146,7 +146,7 @@
           <w:sz w:val="22"/>
           <w:szCs w:val="22"/>
         </w:rPr>
-        <w:t xml:space="preserve">The operator (James Maverick / Bro Alpha) as a reference for decisions about future guard additions and calibrations.</w:t>
+        <w:t>The operator (Bro Alpha) as a reference for decisions about future guard additions and calibrations.</w:t>
       </w:r>
     </w:p>
     <w:p>
@@ -218,7 +218,7 @@
           <w:sz w:val="26"/>
           <w:szCs w:val="26"/>
         </w:rPr>
-        <w:t xml:space="preserve">"The main duty of every guard system is not to fail main system."</w:t>
+        <w:t>"The main duty of every guard system is not to fail main system."  — Bro Alpha, LENS-014, April 18 2026</w:t>
       </w:r>
       <w:r>
         <w:rPr>
@@ -227,7 +227,6 @@
           <w:sz w:val="20"/>
           <w:szCs w:val="20"/>
         </w:rPr>
-        <w:t xml:space="preserve">  — James Maverick, LENS-014, April 18 2026</w:t>
       </w:r>
     </w:p>
     <w:p>
@@ -9120,6 +9119,12 @@
       </w:r>
     </w:p>
     <w:sectPr>
+      <w:headerReference w:type="default" r:id="rId8"/>
+      <w:footerReference w:type="default" r:id="rId9"/>
+      <w:headerReference w:type="first" r:id="rId10"/>
+      <w:footerReference w:type="first" r:id="rId11"/>
+      <w:headerReference w:type="even" r:id="rId12"/>
+      <w:footerReference w:type="even" r:id="rId13"/>
       <w:pgSz w:w="12240" w:h="15840" w:orient="portrait"/>
       <w:pgMar w:top="1440" w:right="1440" w:bottom="1440" w:left="1440" w:header="708" w:footer="708" w:gutter="0"/>
       <w:pgNumType/>
@@ -9170,6 +9175,36 @@
 </w:endnotes>
 </file>
 
+<file path=word/footer1.xml><?xml version="1.0" encoding="utf-8"?>
+<w:ftr xmlns:m="http://schemas.openxmlformats.org/officeDocument/2006/math" xmlns:mc="http://schemas.openxmlformats.org/markup-compatibility/2006" xmlns:mo="http://schemas.microsoft.com/office/mac/office/2008/main" xmlns:mv="urn:schemas-microsoft-com:mac:vml" xmlns:o="urn:schemas-microsoft-com:office:office" xmlns:r="http://schemas.openxmlformats.org/officeDocument/2006/relationships" xmlns:v="urn:schemas-microsoft-com:vml" xmlns:w10="urn:schemas-microsoft-com:office:word" xmlns:w14="http://schemas.microsoft.com/office/word/2010/wordml" xmlns:w="http://schemas.openxmlformats.org/wordprocessingml/2006/main" xmlns:wne="http://schemas.microsoft.com/office/word/2006/wordml" xmlns:wp14="http://schemas.microsoft.com/office/word/2010/wordprocessingDrawing" xmlns:wp="http://schemas.openxmlformats.org/drawingml/2006/wordprocessingDrawing" xmlns:wpc="http://schemas.microsoft.com/office/word/2010/wordprocessingCanvas" xmlns:wpg="http://schemas.microsoft.com/office/word/2010/wordprocessingGroup" xmlns:wpi="http://schemas.microsoft.com/office/word/2010/wordprocessingInk" xmlns:wps="http://schemas.microsoft.com/office/word/2010/wordprocessingShape" mc:Ignorable="w14 wp14">
+  <w:p>
+    <w:pPr>
+      <w:pStyle w:val="Footer"/>
+    </w:pPr>
+  </w:p>
+</w:ftr>
+</file>
+
+<file path=word/footer2.xml><?xml version="1.0" encoding="utf-8"?>
+<w:ftr xmlns:m="http://schemas.openxmlformats.org/officeDocument/2006/math" xmlns:mc="http://schemas.openxmlformats.org/markup-compatibility/2006" xmlns:mo="http://schemas.microsoft.com/office/mac/office/2008/main" xmlns:mv="urn:schemas-microsoft-com:mac:vml" xmlns:o="urn:schemas-microsoft-com:office:office" xmlns:r="http://schemas.openxmlformats.org/officeDocument/2006/relationships" xmlns:v="urn:schemas-microsoft-com:vml" xmlns:w10="urn:schemas-microsoft-com:office:word" xmlns:w14="http://schemas.microsoft.com/office/word/2010/wordml" xmlns:w="http://schemas.openxmlformats.org/wordprocessingml/2006/main" xmlns:wne="http://schemas.microsoft.com/office/word/2006/wordml" xmlns:wp14="http://schemas.microsoft.com/office/word/2010/wordprocessingDrawing" xmlns:wp="http://schemas.openxmlformats.org/drawingml/2006/wordprocessingDrawing" xmlns:wpc="http://schemas.microsoft.com/office/word/2010/wordprocessingCanvas" xmlns:wpg="http://schemas.microsoft.com/office/word/2010/wordprocessingGroup" xmlns:wpi="http://schemas.microsoft.com/office/word/2010/wordprocessingInk" xmlns:wps="http://schemas.microsoft.com/office/word/2010/wordprocessingShape" mc:Ignorable="w14 wp14">
+  <w:p>
+    <w:pPr>
+      <w:pStyle w:val="Footer"/>
+    </w:pPr>
+  </w:p>
+</w:ftr>
+</file>
+
+<file path=word/footer3.xml><?xml version="1.0" encoding="utf-8"?>
+<w:ftr xmlns:m="http://schemas.openxmlformats.org/officeDocument/2006/math" xmlns:mc="http://schemas.openxmlformats.org/markup-compatibility/2006" xmlns:mo="http://schemas.microsoft.com/office/mac/office/2008/main" xmlns:mv="urn:schemas-microsoft-com:mac:vml" xmlns:o="urn:schemas-microsoft-com:office:office" xmlns:r="http://schemas.openxmlformats.org/officeDocument/2006/relationships" xmlns:v="urn:schemas-microsoft-com:vml" xmlns:w10="urn:schemas-microsoft-com:office:word" xmlns:w14="http://schemas.microsoft.com/office/word/2010/wordml" xmlns:w="http://schemas.openxmlformats.org/wordprocessingml/2006/main" xmlns:wne="http://schemas.microsoft.com/office/word/2006/wordml" xmlns:wp14="http://schemas.microsoft.com/office/word/2010/wordprocessingDrawing" xmlns:wp="http://schemas.openxmlformats.org/drawingml/2006/wordprocessingDrawing" xmlns:wpc="http://schemas.microsoft.com/office/word/2010/wordprocessingCanvas" xmlns:wpg="http://schemas.microsoft.com/office/word/2010/wordprocessingGroup" xmlns:wpi="http://schemas.microsoft.com/office/word/2010/wordprocessingInk" xmlns:wps="http://schemas.microsoft.com/office/word/2010/wordprocessingShape" mc:Ignorable="w14 wp14">
+  <w:p>
+    <w:pPr>
+      <w:pStyle w:val="Footer"/>
+    </w:pPr>
+  </w:p>
+</w:ftr>
+</file>
+
 <file path=word/footnotes.xml><?xml version="1.0" encoding="utf-8"?>
 <w:footnotes xmlns:wpc="http://schemas.microsoft.com/office/word/2010/wordprocessingCanvas" xmlns:mc="http://schemas.openxmlformats.org/markup-compatibility/2006" xmlns:o="urn:schemas-microsoft-com:office:office" xmlns:r="http://schemas.openxmlformats.org/officeDocument/2006/relationships" xmlns:m="http://schemas.openxmlformats.org/officeDocument/2006/math" xmlns:v="urn:schemas-microsoft-com:vml" xmlns:wp14="http://schemas.microsoft.com/office/word/2010/wordprocessingDrawing" xmlns:wp="http://schemas.openxmlformats.org/drawingml/2006/wordprocessingDrawing" xmlns:w10="urn:schemas-microsoft-com:office:word" xmlns:w="http://schemas.openxmlformats.org/wordprocessingml/2006/main" xmlns:w14="http://schemas.microsoft.com/office/word/2010/wordml" xmlns:w15="http://schemas.microsoft.com/office/word/2012/wordml" xmlns:wpg="http://schemas.microsoft.com/office/word/2010/wordprocessingGroup" xmlns:wpi="http://schemas.microsoft.com/office/word/2010/wordprocessingInk" xmlns:wne="http://schemas.microsoft.com/office/word/2006/wordml" xmlns:wps="http://schemas.microsoft.com/office/word/2010/wordprocessingShape" mc:Ignorable="w14 w15 wp14">
   <w:footnote w:type="separator" w:id="-1">
@@ -9205,6 +9240,36 @@
     </w:p>
   </w:footnote>
 </w:footnotes>
+</file>
+
+<file path=word/header1.xml><?xml version="1.0" encoding="utf-8"?>
+<w:hdr xmlns:m="http://schemas.openxmlformats.org/officeDocument/2006/math" xmlns:mc="http://schemas.openxmlformats.org/markup-compatibility/2006" xmlns:mo="http://schemas.microsoft.com/office/mac/office/2008/main" xmlns:mv="urn:schemas-microsoft-com:mac:vml" xmlns:o="urn:schemas-microsoft-com:office:office" xmlns:r="http://schemas.openxmlformats.org/officeDocument/2006/relationships" xmlns:v="urn:schemas-microsoft-com:vml" xmlns:w10="urn:schemas-microsoft-com:office:word" xmlns:w14="http://schemas.microsoft.com/office/word/2010/wordml" xmlns:w="http://schemas.openxmlformats.org/wordprocessingml/2006/main" xmlns:wne="http://schemas.microsoft.com/office/word/2006/wordml" xmlns:wp14="http://schemas.microsoft.com/office/word/2010/wordprocessingDrawing" xmlns:wp="http://schemas.openxmlformats.org/drawingml/2006/wordprocessingDrawing" xmlns:wpc="http://schemas.microsoft.com/office/word/2010/wordprocessingCanvas" xmlns:wpg="http://schemas.microsoft.com/office/word/2010/wordprocessingGroup" xmlns:wpi="http://schemas.microsoft.com/office/word/2010/wordprocessingInk" xmlns:wps="http://schemas.microsoft.com/office/word/2010/wordprocessingShape" mc:Ignorable="w14 wp14">
+  <w:p>
+    <w:pPr>
+      <w:pStyle w:val="Header"/>
+    </w:pPr>
+  </w:p>
+</w:hdr>
+</file>
+
+<file path=word/header2.xml><?xml version="1.0" encoding="utf-8"?>
+<w:hdr xmlns:m="http://schemas.openxmlformats.org/officeDocument/2006/math" xmlns:mc="http://schemas.openxmlformats.org/markup-compatibility/2006" xmlns:mo="http://schemas.microsoft.com/office/mac/office/2008/main" xmlns:mv="urn:schemas-microsoft-com:mac:vml" xmlns:o="urn:schemas-microsoft-com:office:office" xmlns:r="http://schemas.openxmlformats.org/officeDocument/2006/relationships" xmlns:v="urn:schemas-microsoft-com:vml" xmlns:w10="urn:schemas-microsoft-com:office:word" xmlns:w14="http://schemas.microsoft.com/office/word/2010/wordml" xmlns:w="http://schemas.openxmlformats.org/wordprocessingml/2006/main" xmlns:wne="http://schemas.microsoft.com/office/word/2006/wordml" xmlns:wp14="http://schemas.microsoft.com/office/word/2010/wordprocessingDrawing" xmlns:wp="http://schemas.openxmlformats.org/drawingml/2006/wordprocessingDrawing" xmlns:wpc="http://schemas.microsoft.com/office/word/2010/wordprocessingCanvas" xmlns:wpg="http://schemas.microsoft.com/office/word/2010/wordprocessingGroup" xmlns:wpi="http://schemas.microsoft.com/office/word/2010/wordprocessingInk" xmlns:wps="http://schemas.microsoft.com/office/word/2010/wordprocessingShape" mc:Ignorable="w14 wp14">
+  <w:p>
+    <w:pPr>
+      <w:pStyle w:val="Header"/>
+    </w:pPr>
+  </w:p>
+</w:hdr>
+</file>
+
+<file path=word/header3.xml><?xml version="1.0" encoding="utf-8"?>
+<w:hdr xmlns:m="http://schemas.openxmlformats.org/officeDocument/2006/math" xmlns:mc="http://schemas.openxmlformats.org/markup-compatibility/2006" xmlns:mo="http://schemas.microsoft.com/office/mac/office/2008/main" xmlns:mv="urn:schemas-microsoft-com:mac:vml" xmlns:o="urn:schemas-microsoft-com:office:office" xmlns:r="http://schemas.openxmlformats.org/officeDocument/2006/relationships" xmlns:v="urn:schemas-microsoft-com:vml" xmlns:w10="urn:schemas-microsoft-com:office:word" xmlns:w14="http://schemas.microsoft.com/office/word/2010/wordml" xmlns:w="http://schemas.openxmlformats.org/wordprocessingml/2006/main" xmlns:wne="http://schemas.microsoft.com/office/word/2006/wordml" xmlns:wp14="http://schemas.microsoft.com/office/word/2010/wordprocessingDrawing" xmlns:wp="http://schemas.openxmlformats.org/drawingml/2006/wordprocessingDrawing" xmlns:wpc="http://schemas.microsoft.com/office/word/2010/wordprocessingCanvas" xmlns:wpg="http://schemas.microsoft.com/office/word/2010/wordprocessingGroup" xmlns:wpi="http://schemas.microsoft.com/office/word/2010/wordprocessingInk" xmlns:wps="http://schemas.microsoft.com/office/word/2010/wordprocessingShape" mc:Ignorable="w14 wp14">
+  <w:p>
+    <w:pPr>
+      <w:pStyle w:val="Header"/>
+    </w:pPr>
+  </w:p>
+</w:hdr>
 </file>
 
 <file path=word/numbering.xml><?xml version="1.0" encoding="utf-8"?>

</xml_diff>